<commit_message>
Refresh EPQ data and results through August 19
</commit_message>
<xml_diff>
--- a/production-log/complete-production-log-en.docx
+++ b/production-log/complete-production-log-en.docx
@@ -242,7 +242,7 @@
             </w:pPr>
             <w:r>
               <w:rPr/>
-              <w:t>2026-08-09</w:t>
+              <w:t>2026-08-20</w:t>
             </w:r>
           </w:p>
         </w:tc>
@@ -2674,7 +2674,7 @@
             </w:pPr>
             <w:r>
               <w:rPr/>
-              <w:t>5,250</w:t>
+              <w:t>5,382</w:t>
             </w:r>
           </w:p>
         </w:tc>
@@ -12123,7 +12123,7 @@
             </w:pPr>
             <w:r>
               <w:rPr/>
-              <w:t>report/final-report.md; current body count: 5,250</w:t>
+              <w:t>report/final-report.md; current body count: 5,382</w:t>
             </w:r>
           </w:p>
         </w:tc>
@@ -12249,7 +12249,7 @@
             </w:pPr>
             <w:r>
               <w:rPr/>
-              <w:t>Completed daily Hyperliquid records; 1,240 completed days retained</w:t>
+              <w:t>Completed daily Hyperliquid records; 1,271 completed days retained through 2026-08-19</w:t>
             </w:r>
           </w:p>
         </w:tc>
@@ -13138,7 +13138,7 @@
       </w:pPr>
       <w:r>
         <w:rPr/>
-        <w:t>PL-11.03 Current 2026-07-26 evidence snapshot</w:t>
+        <w:t>PL-11.03 Current 2026-08-20 evidence snapshot</w:t>
       </w:r>
     </w:p>
     <w:p>
@@ -13150,7 +13150,7 @@
       </w:pPr>
       <w:r>
         <w:rPr/>
-        <w:t>The data archive remains the completed-candle refresh from 2026-07-20. The model figures below come from the full method rerun completed on 2026-07-26 after the final method changes.</w:t>
+        <w:t>The data archive and model outputs were refreshed on 2026-08-20. Because the 2026-08-20 UTC candle was still open, the archive ends with the completed 2026-08-19 candle. The fixed 2025-11-16 test boundary was retained, so the added dates extend the out-of-sample comparison rather than the main training set.</w:t>
       </w:r>
     </w:p>
     <w:tbl>
@@ -13305,7 +13305,7 @@
             </w:pPr>
             <w:r>
               <w:rPr/>
-              <w:t>2026-07-20</w:t>
+              <w:t>2026-08-20</w:t>
             </w:r>
           </w:p>
         </w:tc>
@@ -13368,7 +13368,7 @@
             </w:pPr>
             <w:r>
               <w:rPr/>
-              <w:t>2026-07-20T06:12:26+00:00</w:t>
+              <w:t>2026-08-20T05:05:04+00:00</w:t>
             </w:r>
           </w:p>
         </w:tc>
@@ -13431,7 +13431,7 @@
             </w:pPr>
             <w:r>
               <w:rPr/>
-              <w:t>1,241</w:t>
+              <w:t>1,272</w:t>
             </w:r>
           </w:p>
         </w:tc>
@@ -13557,7 +13557,7 @@
             </w:pPr>
             <w:r>
               <w:rPr/>
-              <w:t>1,240</w:t>
+              <w:t>1,271</w:t>
             </w:r>
           </w:p>
         </w:tc>
@@ -13620,7 +13620,7 @@
             </w:pPr>
             <w:r>
               <w:rPr/>
-              <w:t>2026-07-19</w:t>
+              <w:t>2026-08-19</w:t>
             </w:r>
           </w:p>
         </w:tc>
@@ -13683,7 +13683,7 @@
             </w:pPr>
             <w:r>
               <w:rPr/>
-              <w:t>1,195</w:t>
+              <w:t>1,226</w:t>
             </w:r>
           </w:p>
         </w:tc>
@@ -13809,7 +13809,7 @@
             </w:pPr>
             <w:r>
               <w:rPr/>
-              <w:t>245</w:t>
+              <w:t>276</w:t>
             </w:r>
           </w:p>
         </w:tc>
@@ -13872,7 +13872,7 @@
             </w:pPr>
             <w:r>
               <w:rPr/>
-              <w:t>0.00098502</w:t>
+              <w:t>0.00098301</w:t>
             </w:r>
           </w:p>
         </w:tc>
@@ -13935,7 +13935,7 @@
             </w:pPr>
             <w:r>
               <w:rPr/>
-              <w:t>0.00140087</w:t>
+              <w:t>0.00137492</w:t>
             </w:r>
           </w:p>
         </w:tc>
@@ -13998,7 +13998,7 @@
             </w:pPr>
             <w:r>
               <w:rPr/>
-              <w:t>0.00142744</w:t>
+              <w:t>0.00139570</w:t>
             </w:r>
           </w:p>
         </w:tc>
@@ -14061,7 +14061,7 @@
             </w:pPr>
             <w:r>
               <w:rPr/>
-              <w:t>0.00174351</w:t>
+              <w:t>0.00168735</w:t>
             </w:r>
           </w:p>
         </w:tc>
@@ -14124,7 +14124,7 @@
             </w:pPr>
             <w:r>
               <w:rPr/>
-              <w:t>0.00220594</w:t>
+              <w:t>0.00211129</w:t>
             </w:r>
           </w:p>
         </w:tc>
@@ -14187,7 +14187,7 @@
             </w:pPr>
             <w:r>
               <w:rPr/>
-              <w:t>0.00098681</w:t>
+              <w:t>0.00098432</w:t>
             </w:r>
           </w:p>
         </w:tc>
@@ -14250,7 +14250,7 @@
             </w:pPr>
             <w:r>
               <w:rPr/>
-              <w:t>[-0.00099670, -0.00017158]</w:t>
+              <w:t>[-0.00089954, -0.00016861]</w:t>
             </w:r>
           </w:p>
         </w:tc>
@@ -14376,7 +14376,7 @@
             </w:pPr>
             <w:r>
               <w:rPr/>
-              <w:t>0.00370047</w:t>
+              <w:t>0.00445845</w:t>
             </w:r>
           </w:p>
         </w:tc>
@@ -17496,7 +17496,7 @@
             </w:pPr>
             <w:r>
               <w:rPr/>
-              <w:t>0.00098502</w:t>
+              <w:t>0.00098301</w:t>
             </w:r>
           </w:p>
         </w:tc>
@@ -17559,7 +17559,7 @@
             </w:pPr>
             <w:r>
               <w:rPr/>
-              <w:t>0.00142744</w:t>
+              <w:t>0.00139570</w:t>
             </w:r>
           </w:p>
         </w:tc>
@@ -17622,7 +17622,7 @@
             </w:pPr>
             <w:r>
               <w:rPr/>
-              <w:t>The same method remained first, with an error of 0.00178208.</w:t>
+              <w:t>The same method remained first, with an error of 0.00181314.</w:t>
             </w:r>
           </w:p>
         </w:tc>
@@ -21128,10 +21128,10 @@
         </w:tblCellMar>
       </w:tblPr>
       <w:tblGrid>
-        <w:gridCol w:w="2085"/>
-        <w:gridCol w:w="1453"/>
-        <w:gridCol w:w="1761"/>
-        <w:gridCol w:w="4567"/>
+        <w:gridCol w:w="2050"/>
+        <w:gridCol w:w="1338"/>
+        <w:gridCol w:w="1708"/>
+        <w:gridCol w:w="4770"/>
       </w:tblGrid>
       <w:tr>
         <w:trPr>
@@ -21140,7 +21140,7 @@
         </w:trPr>
         <w:tc>
           <w:tcPr>
-            <w:tcW w:w="2085" w:type="dxa"/>
+            <w:tcW w:w="2050" w:type="dxa"/>
             <w:tcBorders/>
             <w:vAlign w:val="center"/>
             <w:noWrap/>
@@ -21164,7 +21164,7 @@
         </w:tc>
         <w:tc>
           <w:tcPr>
-            <w:tcW w:w="1453" w:type="dxa"/>
+            <w:tcW w:w="1338" w:type="dxa"/>
             <w:tcBorders/>
             <w:vAlign w:val="center"/>
           </w:tcPr>
@@ -21187,7 +21187,7 @@
         </w:tc>
         <w:tc>
           <w:tcPr>
-            <w:tcW w:w="1761" w:type="dxa"/>
+            <w:tcW w:w="1708" w:type="dxa"/>
             <w:tcBorders/>
             <w:vAlign w:val="center"/>
           </w:tcPr>
@@ -21210,7 +21210,7 @@
         </w:tc>
         <w:tc>
           <w:tcPr>
-            <w:tcW w:w="4567" w:type="dxa"/>
+            <w:tcW w:w="4770" w:type="dxa"/>
             <w:tcBorders/>
             <w:vAlign w:val="center"/>
           </w:tcPr>
@@ -21238,7 +21238,7 @@
         </w:trPr>
         <w:tc>
           <w:tcPr>
-            <w:tcW w:w="2085" w:type="dxa"/>
+            <w:tcW w:w="2050" w:type="dxa"/>
             <w:tcBorders/>
             <w:vAlign w:val="center"/>
             <w:noWrap/>
@@ -21258,7 +21258,7 @@
         </w:tc>
         <w:tc>
           <w:tcPr>
-            <w:tcW w:w="1453" w:type="dxa"/>
+            <w:tcW w:w="1338" w:type="dxa"/>
             <w:tcBorders/>
             <w:vAlign w:val="center"/>
           </w:tcPr>
@@ -21277,7 +21277,7 @@
         </w:tc>
         <w:tc>
           <w:tcPr>
-            <w:tcW w:w="1761" w:type="dxa"/>
+            <w:tcW w:w="1708" w:type="dxa"/>
             <w:tcBorders/>
             <w:vAlign w:val="center"/>
           </w:tcPr>
@@ -21296,7 +21296,7 @@
         </w:tc>
         <w:tc>
           <w:tcPr>
-            <w:tcW w:w="4567" w:type="dxa"/>
+            <w:tcW w:w="4770" w:type="dxa"/>
             <w:tcBorders/>
             <w:vAlign w:val="center"/>
           </w:tcPr>
@@ -21320,7 +21320,7 @@
         </w:trPr>
         <w:tc>
           <w:tcPr>
-            <w:tcW w:w="2085" w:type="dxa"/>
+            <w:tcW w:w="2050" w:type="dxa"/>
             <w:tcBorders/>
             <w:vAlign w:val="center"/>
             <w:noWrap/>
@@ -21340,7 +21340,7 @@
         </w:tc>
         <w:tc>
           <w:tcPr>
-            <w:tcW w:w="1453" w:type="dxa"/>
+            <w:tcW w:w="1338" w:type="dxa"/>
             <w:tcBorders/>
             <w:vAlign w:val="center"/>
           </w:tcPr>
@@ -21359,7 +21359,7 @@
         </w:tc>
         <w:tc>
           <w:tcPr>
-            <w:tcW w:w="1761" w:type="dxa"/>
+            <w:tcW w:w="1708" w:type="dxa"/>
             <w:tcBorders/>
             <w:vAlign w:val="center"/>
           </w:tcPr>
@@ -21378,7 +21378,7 @@
         </w:tc>
         <w:tc>
           <w:tcPr>
-            <w:tcW w:w="4567" w:type="dxa"/>
+            <w:tcW w:w="4770" w:type="dxa"/>
             <w:tcBorders/>
             <w:vAlign w:val="center"/>
           </w:tcPr>
@@ -21402,7 +21402,7 @@
         </w:trPr>
         <w:tc>
           <w:tcPr>
-            <w:tcW w:w="2085" w:type="dxa"/>
+            <w:tcW w:w="2050" w:type="dxa"/>
             <w:tcBorders/>
             <w:vAlign w:val="center"/>
             <w:noWrap/>
@@ -21422,7 +21422,7 @@
         </w:tc>
         <w:tc>
           <w:tcPr>
-            <w:tcW w:w="1453" w:type="dxa"/>
+            <w:tcW w:w="1338" w:type="dxa"/>
             <w:tcBorders/>
             <w:vAlign w:val="center"/>
           </w:tcPr>
@@ -21441,7 +21441,7 @@
         </w:tc>
         <w:tc>
           <w:tcPr>
-            <w:tcW w:w="1761" w:type="dxa"/>
+            <w:tcW w:w="1708" w:type="dxa"/>
             <w:tcBorders/>
             <w:vAlign w:val="center"/>
           </w:tcPr>
@@ -21460,7 +21460,7 @@
         </w:tc>
         <w:tc>
           <w:tcPr>
-            <w:tcW w:w="4567" w:type="dxa"/>
+            <w:tcW w:w="4770" w:type="dxa"/>
             <w:tcBorders/>
             <w:vAlign w:val="center"/>
           </w:tcPr>
@@ -21484,7 +21484,7 @@
         </w:trPr>
         <w:tc>
           <w:tcPr>
-            <w:tcW w:w="2085" w:type="dxa"/>
+            <w:tcW w:w="2050" w:type="dxa"/>
             <w:tcBorders/>
             <w:vAlign w:val="center"/>
             <w:noWrap/>
@@ -21504,7 +21504,7 @@
         </w:tc>
         <w:tc>
           <w:tcPr>
-            <w:tcW w:w="1453" w:type="dxa"/>
+            <w:tcW w:w="1338" w:type="dxa"/>
             <w:tcBorders/>
             <w:vAlign w:val="center"/>
           </w:tcPr>
@@ -21523,7 +21523,7 @@
         </w:tc>
         <w:tc>
           <w:tcPr>
-            <w:tcW w:w="1761" w:type="dxa"/>
+            <w:tcW w:w="1708" w:type="dxa"/>
             <w:tcBorders/>
             <w:vAlign w:val="center"/>
           </w:tcPr>
@@ -21542,7 +21542,7 @@
         </w:tc>
         <w:tc>
           <w:tcPr>
-            <w:tcW w:w="4567" w:type="dxa"/>
+            <w:tcW w:w="4770" w:type="dxa"/>
             <w:tcBorders/>
             <w:vAlign w:val="center"/>
           </w:tcPr>
@@ -21566,7 +21566,7 @@
         </w:trPr>
         <w:tc>
           <w:tcPr>
-            <w:tcW w:w="2085" w:type="dxa"/>
+            <w:tcW w:w="2050" w:type="dxa"/>
             <w:tcBorders/>
             <w:vAlign w:val="center"/>
             <w:noWrap/>
@@ -21586,7 +21586,7 @@
         </w:tc>
         <w:tc>
           <w:tcPr>
-            <w:tcW w:w="1453" w:type="dxa"/>
+            <w:tcW w:w="1338" w:type="dxa"/>
             <w:tcBorders/>
             <w:vAlign w:val="center"/>
           </w:tcPr>
@@ -21605,7 +21605,7 @@
         </w:tc>
         <w:tc>
           <w:tcPr>
-            <w:tcW w:w="1761" w:type="dxa"/>
+            <w:tcW w:w="1708" w:type="dxa"/>
             <w:tcBorders/>
             <w:vAlign w:val="center"/>
           </w:tcPr>
@@ -21624,7 +21624,7 @@
         </w:tc>
         <w:tc>
           <w:tcPr>
-            <w:tcW w:w="4567" w:type="dxa"/>
+            <w:tcW w:w="4770" w:type="dxa"/>
             <w:tcBorders/>
             <w:vAlign w:val="center"/>
           </w:tcPr>
@@ -21648,7 +21648,7 @@
         </w:trPr>
         <w:tc>
           <w:tcPr>
-            <w:tcW w:w="2085" w:type="dxa"/>
+            <w:tcW w:w="2050" w:type="dxa"/>
             <w:tcBorders/>
             <w:vAlign w:val="center"/>
             <w:noWrap/>
@@ -21668,7 +21668,7 @@
         </w:tc>
         <w:tc>
           <w:tcPr>
-            <w:tcW w:w="1453" w:type="dxa"/>
+            <w:tcW w:w="1338" w:type="dxa"/>
             <w:tcBorders/>
             <w:vAlign w:val="center"/>
           </w:tcPr>
@@ -21687,7 +21687,7 @@
         </w:tc>
         <w:tc>
           <w:tcPr>
-            <w:tcW w:w="1761" w:type="dxa"/>
+            <w:tcW w:w="1708" w:type="dxa"/>
             <w:tcBorders/>
             <w:vAlign w:val="center"/>
           </w:tcPr>
@@ -21706,7 +21706,7 @@
         </w:tc>
         <w:tc>
           <w:tcPr>
-            <w:tcW w:w="4567" w:type="dxa"/>
+            <w:tcW w:w="4770" w:type="dxa"/>
             <w:tcBorders/>
             <w:vAlign w:val="center"/>
           </w:tcPr>
@@ -21730,7 +21730,7 @@
         </w:trPr>
         <w:tc>
           <w:tcPr>
-            <w:tcW w:w="2085" w:type="dxa"/>
+            <w:tcW w:w="2050" w:type="dxa"/>
             <w:tcBorders/>
             <w:vAlign w:val="center"/>
             <w:noWrap/>
@@ -21750,7 +21750,7 @@
         </w:tc>
         <w:tc>
           <w:tcPr>
-            <w:tcW w:w="1453" w:type="dxa"/>
+            <w:tcW w:w="1338" w:type="dxa"/>
             <w:tcBorders/>
             <w:vAlign w:val="center"/>
           </w:tcPr>
@@ -21769,7 +21769,7 @@
         </w:tc>
         <w:tc>
           <w:tcPr>
-            <w:tcW w:w="1761" w:type="dxa"/>
+            <w:tcW w:w="1708" w:type="dxa"/>
             <w:tcBorders/>
             <w:vAlign w:val="center"/>
           </w:tcPr>
@@ -21788,7 +21788,7 @@
         </w:tc>
         <w:tc>
           <w:tcPr>
-            <w:tcW w:w="4567" w:type="dxa"/>
+            <w:tcW w:w="4770" w:type="dxa"/>
             <w:tcBorders/>
             <w:vAlign w:val="center"/>
           </w:tcPr>
@@ -21812,7 +21812,7 @@
         </w:trPr>
         <w:tc>
           <w:tcPr>
-            <w:tcW w:w="2085" w:type="dxa"/>
+            <w:tcW w:w="2050" w:type="dxa"/>
             <w:tcBorders/>
             <w:vAlign w:val="center"/>
             <w:noWrap/>
@@ -21832,7 +21832,7 @@
         </w:tc>
         <w:tc>
           <w:tcPr>
-            <w:tcW w:w="1453" w:type="dxa"/>
+            <w:tcW w:w="1338" w:type="dxa"/>
             <w:tcBorders/>
             <w:vAlign w:val="center"/>
           </w:tcPr>
@@ -21851,7 +21851,7 @@
         </w:tc>
         <w:tc>
           <w:tcPr>
-            <w:tcW w:w="1761" w:type="dxa"/>
+            <w:tcW w:w="1708" w:type="dxa"/>
             <w:tcBorders/>
             <w:vAlign w:val="center"/>
           </w:tcPr>
@@ -21870,7 +21870,7 @@
         </w:tc>
         <w:tc>
           <w:tcPr>
-            <w:tcW w:w="4567" w:type="dxa"/>
+            <w:tcW w:w="4770" w:type="dxa"/>
             <w:tcBorders/>
             <w:vAlign w:val="center"/>
           </w:tcPr>
@@ -21884,6 +21884,88 @@
             <w:r>
               <w:rPr/>
               <w:t>Narrowed the question, aim and objectives; standardised RF; added training-only RF/LSTM selection, QLIKE and new explanation/practicality evidence; passed 43 tests and reran all model outputs.</w:t>
+            </w:r>
+          </w:p>
+        </w:tc>
+      </w:tr>
+      <w:tr>
+        <w:trPr>
+          <w:cantSplit w:val="1"/>
+        </w:trPr>
+        <w:tc>
+          <w:tcPr>
+            <w:tcW w:w="2050" w:type="dxa"/>
+            <w:tcBorders/>
+            <w:vAlign w:val="center"/>
+            <w:noWrap/>
+          </w:tcPr>
+          <w:p>
+            <w:pPr>
+              <w:pStyle w:val="TableContents"/>
+              <w:bidi w:val="0"/>
+              <w:spacing w:before="0" w:after="283"/>
+              <w:rPr/>
+            </w:pPr>
+            <w:r>
+              <w:rPr/>
+              <w:t>PL-15.01-L</w:t>
+            </w:r>
+          </w:p>
+        </w:tc>
+        <w:tc>
+          <w:tcPr>
+            <w:tcW w:w="1338" w:type="dxa"/>
+            <w:tcBorders/>
+            <w:vAlign w:val="center"/>
+          </w:tcPr>
+          <w:p>
+            <w:pPr>
+              <w:pStyle w:val="TableContents"/>
+              <w:bidi w:val="0"/>
+              <w:spacing w:before="0" w:after="283"/>
+              <w:rPr/>
+            </w:pPr>
+            <w:r>
+              <w:rPr/>
+              <w:t>2026-08-20</w:t>
+            </w:r>
+          </w:p>
+        </w:tc>
+        <w:tc>
+          <w:tcPr>
+            <w:tcW w:w="1708" w:type="dxa"/>
+            <w:tcBorders/>
+            <w:vAlign w:val="center"/>
+          </w:tcPr>
+          <w:p>
+            <w:pPr>
+              <w:pStyle w:val="TableContents"/>
+              <w:bidi w:val="0"/>
+              <w:spacing w:before="0" w:after="283"/>
+              <w:rPr/>
+            </w:pPr>
+            <w:r>
+              <w:rPr/>
+              <w:t>Out-of-sample refresh</w:t>
+            </w:r>
+          </w:p>
+        </w:tc>
+        <w:tc>
+          <w:tcPr>
+            <w:tcW w:w="4770" w:type="dxa"/>
+            <w:tcBorders/>
+            <w:vAlign w:val="center"/>
+          </w:tcPr>
+          <w:p>
+            <w:pPr>
+              <w:pStyle w:val="TableContents"/>
+              <w:bidi w:val="0"/>
+              <w:spacing w:before="0" w:after="283"/>
+              <w:rPr/>
+            </w:pPr>
+            <w:r>
+              <w:rPr/>
+              <w:t>The stored dataset was refreshed without changing the 2025-11-16 test boundary. One unfinished 2026-08-20 candle was excluded, leaving 1,271 complete days through 2026-08-19. The 31 new targets preserved the overall ranking, and the 2026-08-19 volatility jump was retained as an unseen shock rather than used for retrospective tuning.</w:t>
             </w:r>
           </w:p>
         </w:tc>

</xml_diff>